<commit_message>
Improve toy shop catalog and cart
</commit_message>
<xml_diff>
--- a/Documents/КР-6__БИВТ-24-4__Кадыров_Артур_Рустамович__Toy_Shelf.docx
+++ b/Documents/КР-6__БИВТ-24-4__Кадыров_Артур_Рустамович__Toy_Shelf.docx
@@ -335,7 +335,7 @@
           <w:b w:val="0"/>
           <w:sz w:val="24"/>
         </w:rPr>
-        <w:t>Предметной областью курсовой работы является разработка персонального клиент-серверного веб-приложения для учета игрушек и пользователей системы. Приложение Toy Shelf демонстрирует типовой сценарий работы небольшого веб-сервиса: пользователь открывает клиентскую часть в браузере, проходит демонстрационную авторизацию, просматривает каталог игрушек и список пользователей, а при наличии прав администратора создает новых пользователей.</w:t>
+        <w:t>Предметной областью курсовой работы является разработка персонального клиент-серверного веб-приложения для учета игрушек и пользователей системы. Приложение Toy Shelf демонстрирует типовой сценарий работы небольшого интернет-магазина игрушек: пользователь открывает клиентскую часть в браузере, проходит демонстрационную авторизацию, просматривает каталог, фильтрует товары по категориям, добавляет игрушки в корзину и видит итоговую сумму заказа.</w:t>
       </w:r>
     </w:p>
     <w:p>
@@ -462,7 +462,7 @@
           <w:b w:val="0"/>
           <w:sz w:val="24"/>
         </w:rPr>
-        <w:t>Дополнительно реализованы endpoint POST /auth/login для демонстрации категорий доступа и GET /toys для вывода каталога игрушек. Эти возможности не заменяют обязательные endpoint /users, а расширяют приложение и позволяют показать клиентскую работу с ролями.</w:t>
+        <w:t>Дополнительно реализованы endpoint POST /auth/login для демонстрации категорий доступа и GET /toys для вывода каталога игрушек. На клиентской стороне реализована корзина, которая сохраняется в LocalStorage. Эти возможности не заменяют обязательные endpoint /users, а расширяют приложение и позволяют показать более полноценный пользовательский сценарий.</w:t>
       </w:r>
     </w:p>
     <w:p>
@@ -505,7 +505,7 @@
           <w:b w:val="0"/>
           <w:sz w:val="24"/>
         </w:rPr>
-        <w:t>Клиентская часть отвечает за отображение интерфейса, хранение состояния, ввод данных, отправку fetch-запросов и сохранение демо-сессии в LocalStorage. Серверная часть отвечает за маршрутизацию, валидацию данных, выполнение бизнес-логики, формирование JSON-ответов, обработку исключений и логирование запросов.</w:t>
+        <w:t>Клиентская часть отвечает за отображение интерфейса, хранение состояния, ввод данных, отправку fetch-запросов, сохранение демо-сессии и корзины в LocalStorage. Серверная часть отвечает за маршрутизацию, валидацию данных, выполнение бизнес-логики, формирование JSON-ответов, обработку исключений и логирование запросов.</w:t>
       </w:r>
     </w:p>
     <w:p>
@@ -884,7 +884,7 @@
           <w:b w:val="0"/>
           <w:sz w:val="24"/>
         </w:rPr>
-        <w:t>Дополнительная структура Toy используется для отображения темы приложения. Она содержит id, title, category, price и available. Данные игрушек также хранятся в памяти и служат для демонстрации интерфейса и работы клиента с API.</w:t>
+        <w:t>Дополнительная структура Toy используется для отображения темы приложения. Она содержит id, title, category, price, available, stock, rating, description и image. Данные игрушек также хранятся в памяти и служат для демонстрации интерфейса магазина, карточек товаров, фильтра категорий и работы клиента с API.</w:t>
       </w:r>
     </w:p>
     <w:p>
@@ -1895,7 +1895,7 @@
           <w:b w:val="0"/>
           <w:sz w:val="24"/>
         </w:rPr>
-        <w:t>Интерфейс состоит из верхней панели, блока авторизации, списка игрушек, списка пользователей и административной формы создания пользователя. Верхняя панель показывает название приложения и текущую категорию доступа. Если пользователь вошел в систему, рядом отображается кнопка выхода.</w:t>
+        <w:t>Интерфейс состоит из главного блока с краткой статистикой, формы авторизации, каталога игрушек, фильтра категорий, корзины, списка пользователей и административной формы создания пользователя. Верхняя панель показывает текущую категорию доступа. Если пользователь вошел в систему, рядом отображается кнопка выхода.</w:t>
       </w:r>
     </w:p>
     <w:p>
@@ -1923,7 +1923,7 @@
           <w:b w:val="0"/>
           <w:sz w:val="24"/>
         </w:rPr>
-        <w:t>Функции loadSession, saveSession и clearSession находятся в storage.js. Они работают с ключом toy-shelf-session. LocalStorage выбран потому, что он изучается в рамках курса и позволяет показать хранение состояния на стороне клиента. При этом в отчете отдельно отмечено, что чувствительные данные нельзя хранить в LocalStorage без дополнительных мер защиты.</w:t>
+        <w:t>Функции loadSession, saveSession и clearSession находятся в storage.js. Они работают с ключом toy-shelf-session. Для корзины используются loadCart, saveCart и clearCart с отдельным ключом toy-shelf-cart. LocalStorage выбран потому, что он изучается в рамках курса и позволяет показать хранение состояния на стороне клиента. При этом в отчете отдельно отмечено, что чувствительные данные нельзя хранить в LocalStorage без дополнительных мер защиты.</w:t>
       </w:r>
     </w:p>
     <w:p>
@@ -1951,7 +1951,7 @@
           <w:b w:val="0"/>
           <w:sz w:val="24"/>
         </w:rPr>
-        <w:t>Управление доступом реализовано через условный рендеринг. Гость и клиент видят списки игрушек и пользователей. Администратор дополнительно видит форму создания пользователя. После отправки формы клиент вызывает POST /users, затем обновляет список пользователей через GET /users.</w:t>
+        <w:t>Управление доступом реализовано через условный рендеринг. Гость может просматривать витрину, клиент и администратор могут добавлять товары в корзину и оформлять демонстрационный заказ. Администратор дополнительно видит форму создания пользователя. После отправки формы клиент вызывает POST /users, затем обновляет список пользователей через GET /users.</w:t>
       </w:r>
     </w:p>
     <w:p>
@@ -1979,7 +1979,7 @@
           <w:b w:val="0"/>
           <w:sz w:val="24"/>
         </w:rPr>
-        <w:t>Для отчета рекомендуется приложить скриншоты: главный экран приложения, вход под клиентом, вход под администратором, форма создания пользователя, успешное добавление пользователя, ошибка валидации email, ответ GET /users и лог запросов backend в терминале.</w:t>
+        <w:t>Для отчета рекомендуется приложить скриншоты: главный экран приложения, карточки товаров с изображениями, фильтр категорий, корзину с итоговой суммой, вход под клиентом, вход под администратором, форму создания пользователя, успешное добавление пользователя, ошибку валидации email, ответ GET /users, ответ GET /toys и лог запросов backend в терминале.</w:t>
       </w:r>
     </w:p>
     <w:p>
@@ -2022,7 +2022,7 @@
           <w:b w:val="0"/>
           <w:sz w:val="24"/>
         </w:rPr>
-        <w:t>Серверная часть демонстрирует изученные возможности NestJS: модули, контроллеры, сервисы, провайдеры, декораторы, DTO, ValidationPipe, фильтр исключений и middleware логирования. Клиентская часть демонстрирует HTML/JSX, CSS, Fetch API, LocalStorage и управление доступом по категориям пользователей.</w:t>
+        <w:t>Серверная часть демонстрирует изученные возможности NestJS: модули, контроллеры, сервисы, провайдеры, декораторы, DTO, ValidationPipe, фильтр исключений и middleware логирования. Клиентская часть демонстрирует HTML/JSX, CSS, Fetch API, LocalStorage, витрину товаров, корзину и управление доступом по категориям пользователей.</w:t>
       </w:r>
     </w:p>
     <w:p>

</xml_diff>